<commit_message>
Ajsutes varios - Vistas y bordero
</commit_message>
<xml_diff>
--- a/Reportes/FormatoEndososFianzaV2.docx
+++ b/Reportes/FormatoEndososFianzaV2.docx
@@ -136,13 +136,25 @@
               </w:rPr>
               <w:t xml:space="preserve">Póliza </w:t>
             </w:r>
-            <w:r>
-              <w:rPr>
-                <w:sz w:val="14"/>
-                <w:szCs w:val="14"/>
-              </w:rPr>
-              <w:t>Nº:{</w:t>
-            </w:r>
+            <w:proofErr w:type="spellStart"/>
+            <w:proofErr w:type="gramStart"/>
+            <w:r>
+              <w:rPr>
+                <w:sz w:val="14"/>
+                <w:szCs w:val="14"/>
+              </w:rPr>
+              <w:t>Nº</w:t>
+            </w:r>
+            <w:proofErr w:type="spellEnd"/>
+            <w:r>
+              <w:rPr>
+                <w:sz w:val="14"/>
+                <w:szCs w:val="14"/>
+              </w:rPr>
+              <w:t>:{</w:t>
+            </w:r>
+            <w:proofErr w:type="spellStart"/>
+            <w:proofErr w:type="gramEnd"/>
             <w:r>
               <w:rPr>
                 <w:sz w:val="14"/>
@@ -150,6 +162,7 @@
               </w:rPr>
               <w:t>code</w:t>
             </w:r>
+            <w:proofErr w:type="spellEnd"/>
             <w:r>
               <w:rPr>
                 <w:sz w:val="14"/>
@@ -217,6 +230,7 @@
               </w:rPr>
               <w:t>{</w:t>
             </w:r>
+            <w:proofErr w:type="spellStart"/>
             <w:r>
               <w:rPr>
                 <w:b/>
@@ -231,7 +245,16 @@
                 <w:w w:val="105"/>
                 <w:sz w:val="15"/>
               </w:rPr>
-              <w:t>Ramo}</w:t>
+              <w:t>Ramo</w:t>
+            </w:r>
+            <w:proofErr w:type="spellEnd"/>
+            <w:r>
+              <w:rPr>
+                <w:b/>
+                <w:w w:val="105"/>
+                <w:sz w:val="15"/>
+              </w:rPr>
+              <w:t>}</w:t>
             </w:r>
           </w:p>
           <w:p>
@@ -264,15 +287,51 @@
                 <w:sz w:val="14"/>
                 <w:szCs w:val="14"/>
               </w:rPr>
-              <w:t xml:space="preserve">Endoso No. </w:t>
-            </w:r>
-            <w:r>
-              <w:rPr>
-                <w:spacing w:val="-2"/>
-                <w:sz w:val="14"/>
-                <w:szCs w:val="14"/>
-              </w:rPr>
-              <w:t>: {Endoso.Id}</w:t>
+              <w:t>Endoso No</w:t>
+            </w:r>
+            <w:proofErr w:type="gramStart"/>
+            <w:r>
+              <w:rPr>
+                <w:spacing w:val="-2"/>
+                <w:sz w:val="14"/>
+                <w:szCs w:val="14"/>
+              </w:rPr>
+              <w:t xml:space="preserve">. </w:t>
+            </w:r>
+            <w:r>
+              <w:rPr>
+                <w:spacing w:val="-2"/>
+                <w:sz w:val="14"/>
+                <w:szCs w:val="14"/>
+              </w:rPr>
+              <w:t>:</w:t>
+            </w:r>
+            <w:proofErr w:type="gramEnd"/>
+            <w:r>
+              <w:rPr>
+                <w:spacing w:val="-2"/>
+                <w:sz w:val="14"/>
+                <w:szCs w:val="14"/>
+              </w:rPr>
+              <w:t xml:space="preserve"> {</w:t>
+            </w:r>
+            <w:proofErr w:type="spellStart"/>
+            <w:r>
+              <w:rPr>
+                <w:spacing w:val="-2"/>
+                <w:sz w:val="14"/>
+                <w:szCs w:val="14"/>
+              </w:rPr>
+              <w:t>Endoso.Id</w:t>
+            </w:r>
+            <w:proofErr w:type="spellEnd"/>
+            <w:r>
+              <w:rPr>
+                <w:spacing w:val="-2"/>
+                <w:sz w:val="14"/>
+                <w:szCs w:val="14"/>
+              </w:rPr>
+              <w:t>}</w:t>
             </w:r>
           </w:p>
         </w:tc>
@@ -317,16 +376,26 @@
                 <w:w w:val="105"/>
                 <w:sz w:val="15"/>
               </w:rPr>
-              <w:t>{NombreP</w:t>
-            </w:r>
+              <w:t>{</w:t>
+            </w:r>
+            <w:proofErr w:type="spellStart"/>
             <w:r>
               <w:rPr>
                 <w:b/>
                 <w:w w:val="105"/>
                 <w:sz w:val="15"/>
               </w:rPr>
+              <w:t>NombreP</w:t>
+            </w:r>
+            <w:r>
+              <w:rPr>
+                <w:b/>
+                <w:w w:val="105"/>
+                <w:sz w:val="15"/>
+              </w:rPr>
               <w:t>roducto</w:t>
             </w:r>
+            <w:proofErr w:type="spellEnd"/>
             <w:r>
               <w:rPr>
                 <w:b/>
@@ -463,7 +532,29 @@
                 <w:sz w:val="14"/>
                 <w:szCs w:val="14"/>
               </w:rPr>
-              <w:t>{TituloEndosoCan}</w:t>
+              <w:t>{</w:t>
+            </w:r>
+            <w:proofErr w:type="spellStart"/>
+            <w:r>
+              <w:rPr>
+                <w:b/>
+                <w:bCs/>
+                <w:spacing w:val="-2"/>
+                <w:sz w:val="14"/>
+                <w:szCs w:val="14"/>
+              </w:rPr>
+              <w:t>TituloEndosoCan</w:t>
+            </w:r>
+            <w:proofErr w:type="spellEnd"/>
+            <w:r>
+              <w:rPr>
+                <w:b/>
+                <w:bCs/>
+                <w:spacing w:val="-2"/>
+                <w:sz w:val="14"/>
+                <w:szCs w:val="14"/>
+              </w:rPr>
+              <w:t>}</w:t>
             </w:r>
           </w:p>
         </w:tc>
@@ -537,7 +628,15 @@
               <w:pStyle w:val="Textoindependiente"/>
             </w:pPr>
             <w:r>
-              <w:t>{Asegurado.NombreCompleto}</w:t>
+              <w:t>{</w:t>
+            </w:r>
+            <w:proofErr w:type="spellStart"/>
+            <w:r>
+              <w:t>Asegurado.NombreCompleto</w:t>
+            </w:r>
+            <w:proofErr w:type="spellEnd"/>
+            <w:r>
+              <w:t>}</w:t>
             </w:r>
           </w:p>
         </w:tc>
@@ -551,13 +650,23 @@
             <w:pPr>
               <w:pStyle w:val="Textoindependiente"/>
             </w:pPr>
+            <w:proofErr w:type="spellStart"/>
             <w:r>
               <w:rPr>
                 <w:b/>
                 <w:bCs/>
                 <w:lang w:val="es-PA"/>
               </w:rPr>
-              <w:t>Ced/R.U.C:</w:t>
+              <w:t>Ced</w:t>
+            </w:r>
+            <w:proofErr w:type="spellEnd"/>
+            <w:r>
+              <w:rPr>
+                <w:b/>
+                <w:bCs/>
+                <w:lang w:val="es-PA"/>
+              </w:rPr>
+              <w:t>/R.U.C:</w:t>
             </w:r>
           </w:p>
         </w:tc>
@@ -581,12 +690,14 @@
               </w:rPr>
               <w:t>{</w:t>
             </w:r>
+            <w:proofErr w:type="spellStart"/>
             <w:r>
               <w:rPr>
                 <w:spacing w:val="-2"/>
               </w:rPr>
               <w:t>Asegurado.Identificacion</w:t>
             </w:r>
+            <w:proofErr w:type="spellEnd"/>
             <w:r>
               <w:rPr>
                 <w:lang w:val="es-PA"/>
@@ -672,6 +783,7 @@
               </w:rPr>
               <w:t>{</w:t>
             </w:r>
+            <w:proofErr w:type="spellStart"/>
             <w:r>
               <w:rPr>
                 <w:spacing w:val="-2"/>
@@ -690,6 +802,7 @@
               </w:rPr>
               <w:t>Direccion</w:t>
             </w:r>
+            <w:proofErr w:type="spellEnd"/>
             <w:r>
               <w:rPr>
                 <w:spacing w:val="-2"/>
@@ -759,7 +872,15 @@
               <w:pStyle w:val="Textoindependiente"/>
             </w:pPr>
             <w:r>
-              <w:t>{Asegurado.TelefonoContacto}</w:t>
+              <w:t>{</w:t>
+            </w:r>
+            <w:proofErr w:type="spellStart"/>
+            <w:r>
+              <w:t>Asegurado.TelefonoContacto</w:t>
+            </w:r>
+            <w:proofErr w:type="spellEnd"/>
+            <w:r>
+              <w:t>}</w:t>
             </w:r>
           </w:p>
         </w:tc>
@@ -798,7 +919,15 @@
               <w:pStyle w:val="Textoindependiente"/>
             </w:pPr>
             <w:r>
-              <w:t>{Asegurado.TelefonoCelular}</w:t>
+              <w:t>{</w:t>
+            </w:r>
+            <w:proofErr w:type="spellStart"/>
+            <w:r>
+              <w:t>Asegurado.TelefonoCelular</w:t>
+            </w:r>
+            <w:proofErr w:type="spellEnd"/>
+            <w:r>
+              <w:t>}</w:t>
             </w:r>
           </w:p>
         </w:tc>
@@ -848,7 +977,25 @@
                 <w:sz w:val="14"/>
                 <w:szCs w:val="14"/>
               </w:rPr>
-              <w:t>{FechaFinVigencia}</w:t>
+              <w:t>{</w:t>
+            </w:r>
+            <w:proofErr w:type="spellStart"/>
+            <w:r>
+              <w:rPr>
+                <w:spacing w:val="-2"/>
+                <w:sz w:val="14"/>
+                <w:szCs w:val="14"/>
+              </w:rPr>
+              <w:t>FechaFinVigencia</w:t>
+            </w:r>
+            <w:proofErr w:type="spellEnd"/>
+            <w:r>
+              <w:rPr>
+                <w:spacing w:val="-2"/>
+                <w:sz w:val="14"/>
+                <w:szCs w:val="14"/>
+              </w:rPr>
+              <w:t>}</w:t>
             </w:r>
           </w:p>
         </w:tc>
@@ -884,7 +1031,15 @@
               <w:pStyle w:val="Textoindependiente"/>
             </w:pPr>
             <w:r>
-              <w:t>{Address.NombrePais}</w:t>
+              <w:t>{</w:t>
+            </w:r>
+            <w:proofErr w:type="spellStart"/>
+            <w:r>
+              <w:t>Address.NombrePais</w:t>
+            </w:r>
+            <w:proofErr w:type="spellEnd"/>
+            <w:r>
+              <w:t>}</w:t>
             </w:r>
           </w:p>
         </w:tc>
@@ -923,7 +1078,15 @@
               <w:pStyle w:val="Textoindependiente"/>
             </w:pPr>
             <w:r>
-              <w:t>{Asegurado.Email}</w:t>
+              <w:t>{</w:t>
+            </w:r>
+            <w:proofErr w:type="spellStart"/>
+            <w:r>
+              <w:t>Asegurado.Email</w:t>
+            </w:r>
+            <w:proofErr w:type="spellEnd"/>
+            <w:r>
+              <w:t>}</w:t>
             </w:r>
           </w:p>
         </w:tc>
@@ -965,7 +1128,21 @@
               <w:rPr>
                 <w:spacing w:val="-2"/>
               </w:rPr>
-              <w:t>{HoraVigencia}</w:t>
+              <w:t>{</w:t>
+            </w:r>
+            <w:proofErr w:type="spellStart"/>
+            <w:r>
+              <w:rPr>
+                <w:spacing w:val="-2"/>
+              </w:rPr>
+              <w:t>HoraVigencia</w:t>
+            </w:r>
+            <w:proofErr w:type="spellEnd"/>
+            <w:r>
+              <w:rPr>
+                <w:spacing w:val="-2"/>
+              </w:rPr>
+              <w:t>}</w:t>
             </w:r>
           </w:p>
         </w:tc>
@@ -1001,7 +1178,15 @@
               <w:pStyle w:val="Textoindependiente"/>
             </w:pPr>
             <w:r>
-              <w:t>{Address.NombreProvincia}</w:t>
+              <w:t>{</w:t>
+            </w:r>
+            <w:proofErr w:type="spellStart"/>
+            <w:r>
+              <w:t>Address.NombreProvincia</w:t>
+            </w:r>
+            <w:proofErr w:type="spellEnd"/>
+            <w:r>
+              <w:t>}</w:t>
             </w:r>
           </w:p>
         </w:tc>
@@ -1083,7 +1268,15 @@
               <w:pStyle w:val="Textoindependiente"/>
             </w:pPr>
             <w:r>
-              <w:t>{Address.NombreDistrito}</w:t>
+              <w:t>{</w:t>
+            </w:r>
+            <w:proofErr w:type="spellStart"/>
+            <w:r>
+              <w:t>Address.NombreDistrito</w:t>
+            </w:r>
+            <w:proofErr w:type="spellEnd"/>
+            <w:r>
+              <w:t>}</w:t>
             </w:r>
           </w:p>
         </w:tc>
@@ -1151,7 +1344,15 @@
               <w:pStyle w:val="Textoindependiente"/>
             </w:pPr>
             <w:r>
-              <w:t>{FechaEfectiva}</w:t>
+              <w:t>{</w:t>
+            </w:r>
+            <w:proofErr w:type="spellStart"/>
+            <w:r>
+              <w:t>FechaEfectiva</w:t>
+            </w:r>
+            <w:proofErr w:type="spellEnd"/>
+            <w:r>
+              <w:t>}</w:t>
             </w:r>
           </w:p>
         </w:tc>
@@ -1257,7 +1458,15 @@
               <w:pStyle w:val="Textoindependiente"/>
             </w:pPr>
             <w:r>
-              <w:t>{Riesgo.NombreAFavor}</w:t>
+              <w:t>{</w:t>
+            </w:r>
+            <w:proofErr w:type="spellStart"/>
+            <w:r>
+              <w:t>Riesgo.NombreAFavor</w:t>
+            </w:r>
+            <w:proofErr w:type="spellEnd"/>
+            <w:r>
+              <w:t>}</w:t>
             </w:r>
           </w:p>
         </w:tc>
@@ -1311,11 +1520,16 @@
               <w:pStyle w:val="Textoindependiente"/>
             </w:pPr>
             <w:r>
-              <w:t>{Riesgo.</w:t>
+              <w:t>{</w:t>
+            </w:r>
+            <w:proofErr w:type="spellStart"/>
+            <w:r>
+              <w:t>Riesgo.</w:t>
             </w:r>
             <w:r>
               <w:t>SumaAfianzada</w:t>
             </w:r>
+            <w:proofErr w:type="spellEnd"/>
             <w:r>
               <w:t>}</w:t>
             </w:r>
@@ -1405,16 +1619,26 @@
                 <w:spacing w:val="-2"/>
                 <w:w w:val="105"/>
               </w:rPr>
-              <w:t>{Riesgo.</w:t>
-            </w:r>
+              <w:t>{</w:t>
+            </w:r>
+            <w:proofErr w:type="spellStart"/>
             <w:r>
               <w:rPr>
                 <w:bCs/>
                 <w:spacing w:val="-2"/>
                 <w:w w:val="105"/>
               </w:rPr>
+              <w:t>Riesgo.</w:t>
+            </w:r>
+            <w:r>
+              <w:rPr>
+                <w:bCs/>
+                <w:spacing w:val="-2"/>
+                <w:w w:val="105"/>
+              </w:rPr>
               <w:t>FechaActoPublico</w:t>
             </w:r>
+            <w:proofErr w:type="spellEnd"/>
             <w:r>
               <w:rPr>
                 <w:bCs/>
@@ -1475,11 +1699,16 @@
               <w:pStyle w:val="Textoindependiente"/>
             </w:pPr>
             <w:r>
-              <w:t>{Riesgo.</w:t>
+              <w:t>{</w:t>
+            </w:r>
+            <w:proofErr w:type="spellStart"/>
+            <w:r>
+              <w:t>Riesgo.</w:t>
             </w:r>
             <w:r>
               <w:t>NumeroLicitacion</w:t>
             </w:r>
+            <w:proofErr w:type="spellEnd"/>
             <w:r>
               <w:t>}</w:t>
             </w:r>
@@ -1534,7 +1763,15 @@
               <w:pStyle w:val="Textoindependiente"/>
             </w:pPr>
             <w:r>
-              <w:t>{Riesgo.NumeroContrato}</w:t>
+              <w:t>{</w:t>
+            </w:r>
+            <w:proofErr w:type="spellStart"/>
+            <w:r>
+              <w:t>Riesgo.NumeroContrato</w:t>
+            </w:r>
+            <w:proofErr w:type="spellEnd"/>
+            <w:r>
+              <w:t>}</w:t>
             </w:r>
           </w:p>
         </w:tc>
@@ -1588,7 +1825,25 @@
                 <w:spacing w:val="-2"/>
                 <w:w w:val="105"/>
               </w:rPr>
-              <w:t>{Riesgo.ActoPublico}</w:t>
+              <w:t>{</w:t>
+            </w:r>
+            <w:proofErr w:type="spellStart"/>
+            <w:r>
+              <w:rPr>
+                <w:bCs/>
+                <w:spacing w:val="-2"/>
+                <w:w w:val="105"/>
+              </w:rPr>
+              <w:t>Riesgo.ActoPublico</w:t>
+            </w:r>
+            <w:proofErr w:type="spellEnd"/>
+            <w:r>
+              <w:rPr>
+                <w:bCs/>
+                <w:spacing w:val="-2"/>
+                <w:w w:val="105"/>
+              </w:rPr>
+              <w:t>}</w:t>
             </w:r>
           </w:p>
         </w:tc>
@@ -1643,11 +1898,16 @@
               <w:pStyle w:val="Textoindependiente"/>
             </w:pPr>
             <w:r>
-              <w:t>{Riesgo.</w:t>
+              <w:t>{</w:t>
+            </w:r>
+            <w:proofErr w:type="spellStart"/>
+            <w:r>
+              <w:t>Riesgo.</w:t>
             </w:r>
             <w:r>
               <w:t>Descripcion</w:t>
             </w:r>
+            <w:proofErr w:type="spellEnd"/>
             <w:r>
               <w:t>}</w:t>
             </w:r>
@@ -1795,11 +2055,16 @@
             <w:r>
               <w:t>#</w:t>
             </w:r>
+            <w:proofErr w:type="gramStart"/>
             <w:r>
               <w:t>Endoso</w:t>
             </w:r>
             <w:r>
-              <w:t>}{#</w:t>
+              <w:t>}{</w:t>
+            </w:r>
+            <w:proofErr w:type="gramEnd"/>
+            <w:r>
+              <w:t>#</w:t>
             </w:r>
             <w:r>
               <w:t>Coberturas</w:t>
@@ -1828,12 +2093,14 @@
             <w:r>
               <w:t>{</w:t>
             </w:r>
+            <w:proofErr w:type="spellStart"/>
             <w:r>
               <w:t>limit</w:t>
             </w:r>
             <w:r>
               <w:t>Dif</w:t>
             </w:r>
+            <w:proofErr w:type="spellEnd"/>
             <w:r>
               <w:t>}</w:t>
             </w:r>
@@ -1873,14 +2140,21 @@
             <w:r>
               <w:t>{</w:t>
             </w:r>
+            <w:proofErr w:type="spellStart"/>
             <w:r>
               <w:t>premiumDif</w:t>
             </w:r>
+            <w:proofErr w:type="spellEnd"/>
+            <w:proofErr w:type="gramStart"/>
             <w:r>
               <w:t>}</w:t>
             </w:r>
             <w:r>
-              <w:t>{/}</w:t>
+              <w:t>{</w:t>
+            </w:r>
+            <w:proofErr w:type="gramEnd"/>
+            <w:r>
+              <w:t>/}</w:t>
             </w:r>
             <w:r>
               <w:t>{/}</w:t>
@@ -2008,7 +2282,23 @@
                 <w:sz w:val="14"/>
                 <w:szCs w:val="14"/>
               </w:rPr>
-              <w:t>{Endoso.DetalleEndoso}</w:t>
+              <w:t>{</w:t>
+            </w:r>
+            <w:proofErr w:type="spellStart"/>
+            <w:r>
+              <w:rPr>
+                <w:sz w:val="14"/>
+                <w:szCs w:val="14"/>
+              </w:rPr>
+              <w:t>Endoso.DetalleEndoso</w:t>
+            </w:r>
+            <w:proofErr w:type="spellEnd"/>
+            <w:r>
+              <w:rPr>
+                <w:sz w:val="14"/>
+                <w:szCs w:val="14"/>
+              </w:rPr>
+              <w:t>}</w:t>
             </w:r>
           </w:p>
         </w:tc>
@@ -2074,7 +2364,35 @@
                   <w14:bevel/>
                 </w14:textOutline>
               </w:rPr>
-              <w:t>{PrimaNetaTotal}</w:t>
+              <w:t>{</w:t>
+            </w:r>
+            <w:proofErr w:type="spellStart"/>
+            <w:r>
+              <w:rPr>
+                <w:spacing w:val="-2"/>
+                <w:sz w:val="14"/>
+                <w:szCs w:val="14"/>
+                <w14:textOutline w14:w="9525" w14:cap="rnd" w14:cmpd="sng" w14:algn="ctr">
+                  <w14:noFill/>
+                  <w14:prstDash w14:val="solid"/>
+                  <w14:bevel/>
+                </w14:textOutline>
+              </w:rPr>
+              <w:t>PrimaNetaTotal</w:t>
+            </w:r>
+            <w:proofErr w:type="spellEnd"/>
+            <w:r>
+              <w:rPr>
+                <w:spacing w:val="-2"/>
+                <w:sz w:val="14"/>
+                <w:szCs w:val="14"/>
+                <w14:textOutline w14:w="9525" w14:cap="rnd" w14:cmpd="sng" w14:algn="ctr">
+                  <w14:noFill/>
+                  <w14:prstDash w14:val="solid"/>
+                  <w14:bevel/>
+                </w14:textOutline>
+              </w:rPr>
+              <w:t>}</w:t>
             </w:r>
           </w:p>
         </w:tc>
@@ -2263,7 +2581,35 @@
                   <w14:bevel/>
                 </w14:textOutline>
               </w:rPr>
-              <w:t>{TotalACobrar}</w:t>
+              <w:t>{</w:t>
+            </w:r>
+            <w:proofErr w:type="spellStart"/>
+            <w:r>
+              <w:rPr>
+                <w:spacing w:val="-2"/>
+                <w:sz w:val="14"/>
+                <w:szCs w:val="14"/>
+                <w14:textOutline w14:w="9525" w14:cap="rnd" w14:cmpd="sng" w14:algn="ctr">
+                  <w14:noFill/>
+                  <w14:prstDash w14:val="solid"/>
+                  <w14:bevel/>
+                </w14:textOutline>
+              </w:rPr>
+              <w:t>TotalACobrar</w:t>
+            </w:r>
+            <w:proofErr w:type="spellEnd"/>
+            <w:r>
+              <w:rPr>
+                <w:spacing w:val="-2"/>
+                <w:sz w:val="14"/>
+                <w:szCs w:val="14"/>
+                <w14:textOutline w14:w="9525" w14:cap="rnd" w14:cmpd="sng" w14:algn="ctr">
+                  <w14:noFill/>
+                  <w14:prstDash w14:val="solid"/>
+                  <w14:bevel/>
+                </w14:textOutline>
+              </w:rPr>
+              <w:t>}</w:t>
             </w:r>
           </w:p>
         </w:tc>
@@ -2305,6 +2651,7 @@
                 <w:szCs w:val="14"/>
               </w:rPr>
             </w:pPr>
+            <w:proofErr w:type="gramStart"/>
             <w:r>
               <w:rPr>
                 <w:sz w:val="14"/>
@@ -2328,6 +2675,7 @@
               </w:rPr>
               <w:t>entendido</w:t>
             </w:r>
+            <w:proofErr w:type="gramEnd"/>
             <w:r>
               <w:rPr>
                 <w:rFonts w:ascii="Times New Roman" w:hAnsi="Times New Roman"/>
@@ -2738,7 +3086,23 @@
           <w:sz w:val="14"/>
           <w:szCs w:val="14"/>
         </w:rPr>
-        <w:t>{FechaImpresion}</w:t>
+        <w:t>{</w:t>
+      </w:r>
+      <w:proofErr w:type="spellStart"/>
+      <w:r>
+        <w:rPr>
+          <w:sz w:val="14"/>
+          <w:szCs w:val="14"/>
+        </w:rPr>
+        <w:t>FechaImpresion</w:t>
+      </w:r>
+      <w:proofErr w:type="spellEnd"/>
+      <w:r>
+        <w:rPr>
+          <w:sz w:val="14"/>
+          <w:szCs w:val="14"/>
+        </w:rPr>
+        <w:t>}</w:t>
       </w:r>
     </w:p>
     <w:p>
@@ -3015,7 +3379,15 @@
               <w:spacing w:before="3"/>
             </w:pPr>
             <w:r>
-              <w:t>{Asegurado.NombreCompleto}</w:t>
+              <w:t>{</w:t>
+            </w:r>
+            <w:proofErr w:type="spellStart"/>
+            <w:r>
+              <w:t>Asegurado.NombreCompleto</w:t>
+            </w:r>
+            <w:proofErr w:type="spellEnd"/>
+            <w:r>
+              <w:t>}</w:t>
             </w:r>
             <w:r>
               <w:rPr>
@@ -3035,12 +3407,14 @@
               </w:rPr>
               <w:t>{</w:t>
             </w:r>
+            <w:proofErr w:type="spellStart"/>
             <w:r>
               <w:rPr>
                 <w:spacing w:val="-2"/>
               </w:rPr>
               <w:t>Asegurado.Identificacion</w:t>
             </w:r>
+            <w:proofErr w:type="spellEnd"/>
             <w:r>
               <w:rPr>
                 <w:lang w:val="es-PA"/>
@@ -3441,6 +3815,7 @@
               </w:rPr>
               <w:t xml:space="preserve"> </w:t>
             </w:r>
+            <w:proofErr w:type="gramStart"/>
             <w:r>
               <w:rPr>
                 <w:w w:val="105"/>
@@ -3464,7 +3839,16 @@
                 <w:sz w:val="14"/>
                 <w:szCs w:val="14"/>
               </w:rPr>
-              <w:t>507)</w:t>
+              <w:t>507</w:t>
+            </w:r>
+            <w:proofErr w:type="gramEnd"/>
+            <w:r>
+              <w:rPr>
+                <w:w w:val="105"/>
+                <w:sz w:val="14"/>
+                <w:szCs w:val="14"/>
+              </w:rPr>
+              <w:t>)</w:t>
             </w:r>
             <w:r>
               <w:rPr>
@@ -3520,6 +3904,7 @@
               </w:rPr>
               <w:t xml:space="preserve"> </w:t>
             </w:r>
+            <w:proofErr w:type="gramStart"/>
             <w:r>
               <w:rPr>
                 <w:w w:val="105"/>
@@ -3543,7 +3928,16 @@
                 <w:sz w:val="14"/>
                 <w:szCs w:val="14"/>
               </w:rPr>
-              <w:t>507)</w:t>
+              <w:t>507</w:t>
+            </w:r>
+            <w:proofErr w:type="gramEnd"/>
+            <w:r>
+              <w:rPr>
+                <w:w w:val="105"/>
+                <w:sz w:val="14"/>
+                <w:szCs w:val="14"/>
+              </w:rPr>
+              <w:t>)</w:t>
             </w:r>
             <w:r>
               <w:rPr>
@@ -3622,354 +4016,44 @@
 <w:ftr xmlns:wpc="http://schemas.microsoft.com/office/word/2010/wordprocessingCanvas" xmlns:cx="http://schemas.microsoft.com/office/drawing/2014/chartex" xmlns:cx1="http://schemas.microsoft.com/office/drawing/2015/9/8/chartex" xmlns:cx2="http://schemas.microsoft.com/office/drawing/2015/10/21/chartex" xmlns:cx3="http://schemas.microsoft.com/office/drawing/2016/5/9/chartex" xmlns:cx4="http://schemas.microsoft.com/office/drawing/2016/5/10/chartex" xmlns:cx5="http://schemas.microsoft.com/office/drawing/2016/5/11/chartex" xmlns:cx6="http://schemas.microsoft.com/office/drawing/2016/5/12/chartex" xmlns:cx7="http://schemas.microsoft.com/office/drawing/2016/5/13/chartex" xmlns:cx8="http://schemas.microsoft.com/office/drawing/2016/5/14/chartex" xmlns:mc="http://schemas.openxmlformats.org/markup-compatibility/2006" xmlns:aink="http://schemas.microsoft.com/office/drawing/2016/ink" xmlns:am3d="http://schemas.microsoft.com/office/drawing/2017/model3d" xmlns:o="urn:schemas-microsoft-com:office:office" xmlns:oel="http://schemas.microsoft.com/office/2019/extlst" xmlns:r="http://schemas.openxmlformats.org/officeDocument/2006/relationships" xmlns:m="http://schemas.openxmlformats.org/officeDocument/2006/math" xmlns:v="urn:schemas-microsoft-com:vml" xmlns:wp14="http://schemas.microsoft.com/office/word/2010/wordprocessingDrawing" xmlns:wp="http://schemas.openxmlformats.org/drawingml/2006/wordprocessingDrawing" xmlns:w10="urn:schemas-microsoft-com:office:word" xmlns:w="http://schemas.openxmlformats.org/wordprocessingml/2006/main" xmlns:w14="http://schemas.microsoft.com/office/word/2010/wordml" xmlns:w15="http://schemas.microsoft.com/office/word/2012/wordml" xmlns:w16cex="http://schemas.microsoft.com/office/word/2018/wordml/cex" xmlns:w16cid="http://schemas.microsoft.com/office/word/2016/wordml/cid" xmlns:w16="http://schemas.microsoft.com/office/word/2018/wordml" xmlns:w16sdtdh="http://schemas.microsoft.com/office/word/2020/wordml/sdtdatahash" xmlns:w16se="http://schemas.microsoft.com/office/word/2015/wordml/symex" xmlns:wpg="http://schemas.microsoft.com/office/word/2010/wordprocessingGroup" xmlns:wpi="http://schemas.microsoft.com/office/word/2010/wordprocessingInk" xmlns:wne="http://schemas.microsoft.com/office/word/2006/wordml" xmlns:wps="http://schemas.microsoft.com/office/word/2010/wordprocessingShape" mc:Ignorable="w14 w15 w16se w16cid w16 w16cex w16sdtdh wp14">
   <w:p>
     <w:pPr>
-      <w:pStyle w:val="Textoindependiente"/>
-      <w:spacing w:line="14" w:lineRule="auto"/>
-      <w:rPr>
-        <w:sz w:val="20"/>
-      </w:rPr>
+      <w:jc w:val="center"/>
     </w:pPr>
     <w:r>
       <w:rPr>
-        <w:noProof/>
-        <w:lang w:eastAsia="es-ES"/>
+        <w:b/>
+        <w:bCs/>
+        <w:sz w:val="16"/>
+        <w:szCs w:val="16"/>
       </w:rPr>
-      <mc:AlternateContent>
-        <mc:Choice Requires="wps">
-          <w:drawing>
-            <wp:anchor distT="0" distB="0" distL="114300" distR="114300" simplePos="0" relativeHeight="251657728" behindDoc="1" locked="0" layoutInCell="1" allowOverlap="1" wp14:anchorId="184386FA" wp14:editId="1AC6A449">
-              <wp:simplePos x="0" y="0"/>
-              <wp:positionH relativeFrom="page">
-                <wp:posOffset>311150</wp:posOffset>
-              </wp:positionH>
-              <wp:positionV relativeFrom="page">
-                <wp:posOffset>10313035</wp:posOffset>
-              </wp:positionV>
-              <wp:extent cx="3563620" cy="127000"/>
-              <wp:effectExtent l="0" t="0" r="0" b="0"/>
-              <wp:wrapNone/>
-              <wp:docPr id="2" name="docshape1"/>
-              <wp:cNvGraphicFramePr>
-                <a:graphicFrameLocks xmlns:a="http://schemas.openxmlformats.org/drawingml/2006/main"/>
-              </wp:cNvGraphicFramePr>
-              <a:graphic xmlns:a="http://schemas.openxmlformats.org/drawingml/2006/main">
-                <a:graphicData uri="http://schemas.microsoft.com/office/word/2010/wordprocessingShape">
-                  <wps:wsp>
-                    <wps:cNvSpPr txBox="1">
-                      <a:spLocks noChangeArrowheads="1"/>
-                    </wps:cNvSpPr>
-                    <wps:spPr bwMode="auto">
-                      <a:xfrm>
-                        <a:off x="0" y="0"/>
-                        <a:ext cx="3563620" cy="127000"/>
-                      </a:xfrm>
-                      <a:prstGeom prst="rect">
-                        <a:avLst/>
-                      </a:prstGeom>
-                      <a:noFill/>
-                      <a:ln>
-                        <a:noFill/>
-                      </a:ln>
-                      <a:extLst>
-                        <a:ext uri="{909E8E84-426E-40DD-AFC4-6F175D3DCCD1}">
-                          <a14:hiddenFill xmlns:a14="http://schemas.microsoft.com/office/drawing/2010/main">
-                            <a:solidFill>
-                              <a:srgbClr val="FFFFFF"/>
-                            </a:solidFill>
-                          </a14:hiddenFill>
-                        </a:ext>
-                        <a:ext uri="{91240B29-F687-4F45-9708-019B960494DF}">
-                          <a14:hiddenLine xmlns:a14="http://schemas.microsoft.com/office/drawing/2010/main" w="9525">
-                            <a:solidFill>
-                              <a:srgbClr val="000000"/>
-                            </a:solidFill>
-                            <a:miter lim="800000"/>
-                            <a:headEnd/>
-                            <a:tailEnd/>
-                          </a14:hiddenLine>
-                        </a:ext>
-                      </a:extLst>
-                    </wps:spPr>
-                    <wps:txbx>
-                      <w:txbxContent>
-                        <w:p>
-                          <w:pPr>
-                            <w:pStyle w:val="Textoindependiente"/>
-                            <w:spacing w:before="18"/>
-                            <w:ind w:left="20"/>
-                          </w:pPr>
-                          <w:r>
-                            <w:t>Regulado</w:t>
-                          </w:r>
-                          <w:r>
-                            <w:rPr>
-                              <w:rFonts w:ascii="Times New Roman" w:hAnsi="Times New Roman"/>
-                              <w:spacing w:val="10"/>
-                            </w:rPr>
-                            <w:t xml:space="preserve"> </w:t>
-                          </w:r>
-                          <w:r>
-                            <w:t>y</w:t>
-                          </w:r>
-                          <w:r>
-                            <w:rPr>
-                              <w:rFonts w:ascii="Times New Roman" w:hAnsi="Times New Roman"/>
-                              <w:spacing w:val="10"/>
-                            </w:rPr>
-                            <w:t xml:space="preserve"> </w:t>
-                          </w:r>
-                          <w:r>
-                            <w:t>Supervisado</w:t>
-                          </w:r>
-                          <w:r>
-                            <w:rPr>
-                              <w:rFonts w:ascii="Times New Roman" w:hAnsi="Times New Roman"/>
-                              <w:spacing w:val="10"/>
-                            </w:rPr>
-                            <w:t xml:space="preserve"> </w:t>
-                          </w:r>
-                          <w:r>
-                            <w:t>por</w:t>
-                          </w:r>
-                          <w:r>
-                            <w:rPr>
-                              <w:rFonts w:ascii="Times New Roman" w:hAnsi="Times New Roman"/>
-                              <w:spacing w:val="11"/>
-                            </w:rPr>
-                            <w:t xml:space="preserve"> </w:t>
-                          </w:r>
-                          <w:r>
-                            <w:t>la</w:t>
-                          </w:r>
-                          <w:r>
-                            <w:rPr>
-                              <w:rFonts w:ascii="Times New Roman" w:hAnsi="Times New Roman"/>
-                              <w:spacing w:val="10"/>
-                            </w:rPr>
-                            <w:t xml:space="preserve"> </w:t>
-                          </w:r>
-                          <w:r>
-                            <w:t>Superintendencia</w:t>
-                          </w:r>
-                          <w:r>
-                            <w:rPr>
-                              <w:rFonts w:ascii="Times New Roman" w:hAnsi="Times New Roman"/>
-                              <w:spacing w:val="10"/>
-                            </w:rPr>
-                            <w:t xml:space="preserve"> </w:t>
-                          </w:r>
-                          <w:r>
-                            <w:t>de</w:t>
-                          </w:r>
-                          <w:r>
-                            <w:rPr>
-                              <w:rFonts w:ascii="Times New Roman" w:hAnsi="Times New Roman"/>
-                              <w:spacing w:val="11"/>
-                            </w:rPr>
-                            <w:t xml:space="preserve"> </w:t>
-                          </w:r>
-                          <w:r>
-                            <w:t>Seguros</w:t>
-                          </w:r>
-                          <w:r>
-                            <w:rPr>
-                              <w:rFonts w:ascii="Times New Roman" w:hAnsi="Times New Roman"/>
-                              <w:spacing w:val="10"/>
-                            </w:rPr>
-                            <w:t xml:space="preserve"> </w:t>
-                          </w:r>
-                          <w:r>
-                            <w:t>y</w:t>
-                          </w:r>
-                          <w:r>
-                            <w:rPr>
-                              <w:rFonts w:ascii="Times New Roman" w:hAnsi="Times New Roman"/>
-                              <w:spacing w:val="10"/>
-                            </w:rPr>
-                            <w:t xml:space="preserve"> </w:t>
-                          </w:r>
-                          <w:r>
-                            <w:t>Reaseguros</w:t>
-                          </w:r>
-                          <w:r>
-                            <w:rPr>
-                              <w:rFonts w:ascii="Times New Roman" w:hAnsi="Times New Roman"/>
-                              <w:spacing w:val="10"/>
-                            </w:rPr>
-                            <w:t xml:space="preserve"> </w:t>
-                          </w:r>
-                          <w:r>
-                            <w:t>de</w:t>
-                          </w:r>
-                          <w:r>
-                            <w:rPr>
-                              <w:rFonts w:ascii="Times New Roman" w:hAnsi="Times New Roman"/>
-                              <w:spacing w:val="11"/>
-                            </w:rPr>
-                            <w:t xml:space="preserve"> </w:t>
-                          </w:r>
-                          <w:r>
-                            <w:rPr>
-                              <w:spacing w:val="-2"/>
-                            </w:rPr>
-                            <w:t>Panamá</w:t>
-                          </w:r>
-                        </w:p>
-                      </w:txbxContent>
-                    </wps:txbx>
-                    <wps:bodyPr rot="0" vert="horz" wrap="square" lIns="0" tIns="0" rIns="0" bIns="0" anchor="t" anchorCtr="0" upright="1">
-                      <a:noAutofit/>
-                    </wps:bodyPr>
-                  </wps:wsp>
-                </a:graphicData>
-              </a:graphic>
-              <wp14:sizeRelH relativeFrom="page">
-                <wp14:pctWidth>0</wp14:pctWidth>
-              </wp14:sizeRelH>
-              <wp14:sizeRelV relativeFrom="page">
-                <wp14:pctHeight>0</wp14:pctHeight>
-              </wp14:sizeRelV>
-            </wp:anchor>
-          </w:drawing>
-        </mc:Choice>
-        <mc:Fallback>
-          <w:pict>
-            <v:shapetype w14:anchorId="184386FA" id="_x0000_t202" coordsize="21600,21600" o:spt="202" path="m,l,21600r21600,l21600,xe">
-              <v:stroke joinstyle="miter"/>
-              <v:path gradientshapeok="t" o:connecttype="rect"/>
-            </v:shapetype>
-            <v:shape id="docshape1" o:spid="_x0000_s1026" type="#_x0000_t202" style="position:absolute;margin-left:24.5pt;margin-top:812.05pt;width:280.6pt;height:10pt;z-index:-251658752;visibility:visible;mso-wrap-style:square;mso-width-percent:0;mso-height-percent:0;mso-wrap-distance-left:9pt;mso-wrap-distance-top:0;mso-wrap-distance-right:9pt;mso-wrap-distance-bottom:0;mso-position-horizontal:absolute;mso-position-horizontal-relative:page;mso-position-vertical:absolute;mso-position-vertical-relative:page;mso-width-percent:0;mso-height-percent:0;mso-width-relative:page;mso-height-relative:page;v-text-anchor:top" o:gfxdata="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" filled="f" stroked="f">
-              <v:textbox inset="0,0,0,0">
-                <w:txbxContent>
-                  <w:p>
-                    <w:pPr>
-                      <w:pStyle w:val="Textoindependiente"/>
-                      <w:spacing w:before="18"/>
-                      <w:ind w:left="20"/>
-                    </w:pPr>
-                    <w:r>
-                      <w:t>Regulado</w:t>
-                    </w:r>
-                    <w:r>
-                      <w:rPr>
-                        <w:rFonts w:ascii="Times New Roman" w:hAnsi="Times New Roman"/>
-                        <w:spacing w:val="10"/>
-                      </w:rPr>
-                      <w:t xml:space="preserve"> </w:t>
-                    </w:r>
-                    <w:r>
-                      <w:t>y</w:t>
-                    </w:r>
-                    <w:r>
-                      <w:rPr>
-                        <w:rFonts w:ascii="Times New Roman" w:hAnsi="Times New Roman"/>
-                        <w:spacing w:val="10"/>
-                      </w:rPr>
-                      <w:t xml:space="preserve"> </w:t>
-                    </w:r>
-                    <w:r>
-                      <w:t>Supervisado</w:t>
-                    </w:r>
-                    <w:r>
-                      <w:rPr>
-                        <w:rFonts w:ascii="Times New Roman" w:hAnsi="Times New Roman"/>
-                        <w:spacing w:val="10"/>
-                      </w:rPr>
-                      <w:t xml:space="preserve"> </w:t>
-                    </w:r>
-                    <w:r>
-                      <w:t>por</w:t>
-                    </w:r>
-                    <w:r>
-                      <w:rPr>
-                        <w:rFonts w:ascii="Times New Roman" w:hAnsi="Times New Roman"/>
-                        <w:spacing w:val="11"/>
-                      </w:rPr>
-                      <w:t xml:space="preserve"> </w:t>
-                    </w:r>
-                    <w:r>
-                      <w:t>la</w:t>
-                    </w:r>
-                    <w:r>
-                      <w:rPr>
-                        <w:rFonts w:ascii="Times New Roman" w:hAnsi="Times New Roman"/>
-                        <w:spacing w:val="10"/>
-                      </w:rPr>
-                      <w:t xml:space="preserve"> </w:t>
-                    </w:r>
-                    <w:r>
-                      <w:t>Superintendencia</w:t>
-                    </w:r>
-                    <w:r>
-                      <w:rPr>
-                        <w:rFonts w:ascii="Times New Roman" w:hAnsi="Times New Roman"/>
-                        <w:spacing w:val="10"/>
-                      </w:rPr>
-                      <w:t xml:space="preserve"> </w:t>
-                    </w:r>
-                    <w:r>
-                      <w:t>de</w:t>
-                    </w:r>
-                    <w:r>
-                      <w:rPr>
-                        <w:rFonts w:ascii="Times New Roman" w:hAnsi="Times New Roman"/>
-                        <w:spacing w:val="11"/>
-                      </w:rPr>
-                      <w:t xml:space="preserve"> </w:t>
-                    </w:r>
-                    <w:r>
-                      <w:t>Seguros</w:t>
-                    </w:r>
-                    <w:r>
-                      <w:rPr>
-                        <w:rFonts w:ascii="Times New Roman" w:hAnsi="Times New Roman"/>
-                        <w:spacing w:val="10"/>
-                      </w:rPr>
-                      <w:t xml:space="preserve"> </w:t>
-                    </w:r>
-                    <w:r>
-                      <w:t>y</w:t>
-                    </w:r>
-                    <w:r>
-                      <w:rPr>
-                        <w:rFonts w:ascii="Times New Roman" w:hAnsi="Times New Roman"/>
-                        <w:spacing w:val="10"/>
-                      </w:rPr>
-                      <w:t xml:space="preserve"> </w:t>
-                    </w:r>
-                    <w:r>
-                      <w:t>Reaseguros</w:t>
-                    </w:r>
-                    <w:r>
-                      <w:rPr>
-                        <w:rFonts w:ascii="Times New Roman" w:hAnsi="Times New Roman"/>
-                        <w:spacing w:val="10"/>
-                      </w:rPr>
-                      <w:t xml:space="preserve"> </w:t>
-                    </w:r>
-                    <w:r>
-                      <w:t>de</w:t>
-                    </w:r>
-                    <w:r>
-                      <w:rPr>
-                        <w:rFonts w:ascii="Times New Roman" w:hAnsi="Times New Roman"/>
-                        <w:spacing w:val="11"/>
-                      </w:rPr>
-                      <w:t xml:space="preserve"> </w:t>
-                    </w:r>
-                    <w:r>
-                      <w:rPr>
-                        <w:spacing w:val="-2"/>
-                      </w:rPr>
-                      <w:t>Panamá</w:t>
-                    </w:r>
-                  </w:p>
-                </w:txbxContent>
-              </v:textbox>
-              <w10:wrap anchorx="page" anchory="page"/>
-            </v:shape>
-          </w:pict>
-        </mc:Fallback>
-      </mc:AlternateContent>
+      <w:t>Regulado y Supervisado por la Superintendencia de Seguros y Reaseguros de Panamá</w:t>
+    </w:r>
+  </w:p>
+  <w:p>
+    <w:pPr>
+      <w:jc w:val="center"/>
+    </w:pPr>
+    <w:r>
+      <w:rPr>
+        <w:sz w:val="14"/>
+        <w:szCs w:val="14"/>
+      </w:rPr>
+      <w:t xml:space="preserve">Calle 50 Torre Global Bank. </w:t>
+    </w:r>
+    <w:proofErr w:type="spellStart"/>
+    <w:r>
+      <w:rPr>
+        <w:sz w:val="14"/>
+        <w:szCs w:val="14"/>
+      </w:rPr>
+      <w:t>Mezzanine</w:t>
+    </w:r>
+    <w:proofErr w:type="spellEnd"/>
+    <w:r>
+      <w:rPr>
+        <w:sz w:val="14"/>
+        <w:szCs w:val="14"/>
+      </w:rPr>
+      <w:t xml:space="preserve"> | Tlf. 206-2021 | www.aseguradoraglobal.com.pa | info@aseguradoraglobal.com.pa</w:t>
     </w:r>
   </w:p>
 </w:ftr>
@@ -4580,6 +4664,56 @@
       <w:lang w:val="es-ES"/>
     </w:rPr>
   </w:style>
+  <w:style w:type="paragraph" w:styleId="Encabezado">
+    <w:name w:val="header"/>
+    <w:basedOn w:val="Normal"/>
+    <w:link w:val="EncabezadoCar"/>
+    <w:uiPriority w:val="99"/>
+    <w:unhideWhenUsed/>
+    <w:rsid w:val="0050125D"/>
+    <w:pPr>
+      <w:tabs>
+        <w:tab w:val="center" w:pos="4419"/>
+        <w:tab w:val="right" w:pos="8838"/>
+      </w:tabs>
+    </w:pPr>
+  </w:style>
+  <w:style w:type="character" w:customStyle="1" w:styleId="EncabezadoCar">
+    <w:name w:val="Encabezado Car"/>
+    <w:basedOn w:val="Fuentedeprrafopredeter"/>
+    <w:link w:val="Encabezado"/>
+    <w:uiPriority w:val="99"/>
+    <w:rsid w:val="0050125D"/>
+    <w:rPr>
+      <w:rFonts w:ascii="Arial" w:eastAsia="Arial" w:hAnsi="Arial" w:cs="Arial"/>
+      <w:lang w:val="es-ES"/>
+    </w:rPr>
+  </w:style>
+  <w:style w:type="paragraph" w:styleId="Piedepgina">
+    <w:name w:val="footer"/>
+    <w:basedOn w:val="Normal"/>
+    <w:link w:val="PiedepginaCar"/>
+    <w:uiPriority w:val="99"/>
+    <w:unhideWhenUsed/>
+    <w:rsid w:val="0050125D"/>
+    <w:pPr>
+      <w:tabs>
+        <w:tab w:val="center" w:pos="4419"/>
+        <w:tab w:val="right" w:pos="8838"/>
+      </w:tabs>
+    </w:pPr>
+  </w:style>
+  <w:style w:type="character" w:customStyle="1" w:styleId="PiedepginaCar">
+    <w:name w:val="Pie de página Car"/>
+    <w:basedOn w:val="Fuentedeprrafopredeter"/>
+    <w:link w:val="Piedepgina"/>
+    <w:uiPriority w:val="99"/>
+    <w:rsid w:val="0050125D"/>
+    <w:rPr>
+      <w:rFonts w:ascii="Arial" w:eastAsia="Arial" w:hAnsi="Arial" w:cs="Arial"/>
+      <w:lang w:val="es-ES"/>
+    </w:rPr>
+  </w:style>
 </w:styles>
 </file>
 

</xml_diff>